<commit_message>
mar3iano first time discussion
</commit_message>
<xml_diff>
--- a/Use Cases.docx
+++ b/Use Cases.docx
@@ -1201,6 +1201,13 @@
         </w:rPr>
         <w:t>s</w:t>
       </w:r>
+      <w:r>
+        <w:rPr>
+          <w:sz w:val="40"/>
+          <w:szCs w:val="40"/>
+        </w:rPr>
+        <w:t xml:space="preserve"> / Vendors</w:t>
+      </w:r>
     </w:p>
     <w:p>
       <w:pPr>
@@ -1219,96 +1226,42 @@
           <w:sz w:val="40"/>
           <w:szCs w:val="40"/>
         </w:rPr>
+        <w:t xml:space="preserve">(Approve, Reject) </w:t>
+      </w:r>
+      <w:r>
+        <w:rPr>
+          <w:sz w:val="40"/>
+          <w:szCs w:val="40"/>
+        </w:rPr>
+        <w:t>Product</w:t>
+      </w:r>
+      <w:r>
+        <w:rPr>
+          <w:sz w:val="40"/>
+          <w:szCs w:val="40"/>
+        </w:rPr>
+        <w:t>s</w:t>
+      </w:r>
+    </w:p>
+    <w:p>
+      <w:pPr>
+        <w:pStyle w:val="ListParagraph"/>
+        <w:numPr>
+          <w:ilvl w:val="0"/>
+          <w:numId w:val="7"/>
+        </w:numPr>
+        <w:rPr>
+          <w:sz w:val="40"/>
+          <w:szCs w:val="40"/>
+        </w:rPr>
+      </w:pPr>
+      <w:r>
+        <w:rPr>
+          <w:sz w:val="40"/>
+          <w:szCs w:val="40"/>
+        </w:rPr>
         <w:lastRenderedPageBreak/>
-        <w:t xml:space="preserve">(View, Ban, Edit) </w:t>
-      </w:r>
-      <w:r>
-        <w:rPr>
-          <w:sz w:val="40"/>
-          <w:szCs w:val="40"/>
-        </w:rPr>
-        <w:t>Vendor</w:t>
-      </w:r>
-      <w:r>
-        <w:rPr>
-          <w:sz w:val="40"/>
-          <w:szCs w:val="40"/>
-        </w:rPr>
-        <w:t>s</w:t>
-      </w:r>
-    </w:p>
-    <w:p>
-      <w:pPr>
-        <w:pStyle w:val="ListParagraph"/>
-        <w:numPr>
-          <w:ilvl w:val="0"/>
-          <w:numId w:val="7"/>
-        </w:numPr>
-        <w:rPr>
-          <w:sz w:val="40"/>
-          <w:szCs w:val="40"/>
-        </w:rPr>
-      </w:pPr>
-      <w:r>
-        <w:rPr>
-          <w:sz w:val="40"/>
-          <w:szCs w:val="40"/>
-        </w:rPr>
-        <w:t xml:space="preserve">(Approve, Reject) </w:t>
-      </w:r>
-      <w:r>
-        <w:rPr>
-          <w:sz w:val="40"/>
-          <w:szCs w:val="40"/>
-        </w:rPr>
-        <w:t>Product</w:t>
-      </w:r>
-      <w:r>
-        <w:rPr>
-          <w:sz w:val="40"/>
-          <w:szCs w:val="40"/>
-        </w:rPr>
-        <w:t>s</w:t>
-      </w:r>
-    </w:p>
-    <w:p>
-      <w:pPr>
-        <w:pStyle w:val="ListParagraph"/>
-        <w:numPr>
-          <w:ilvl w:val="0"/>
-          <w:numId w:val="7"/>
-        </w:numPr>
-        <w:rPr>
-          <w:sz w:val="40"/>
-          <w:szCs w:val="40"/>
-        </w:rPr>
-      </w:pPr>
-      <w:r>
-        <w:rPr>
-          <w:sz w:val="40"/>
-          <w:szCs w:val="40"/>
-        </w:rPr>
         <w:t>Order Monitoring</w:t>
-      </w:r>
-    </w:p>
-    <w:p>
-      <w:pPr>
-        <w:pStyle w:val="ListParagraph"/>
-        <w:numPr>
-          <w:ilvl w:val="0"/>
-          <w:numId w:val="7"/>
-        </w:numPr>
-        <w:rPr>
-          <w:sz w:val="40"/>
-          <w:szCs w:val="40"/>
-        </w:rPr>
-      </w:pPr>
-      <w:r>
-        <w:rPr>
-          <w:sz w:val="40"/>
-          <w:szCs w:val="40"/>
-        </w:rPr>
-        <w:t>Revenue Reports</w:t>
       </w:r>
     </w:p>
     <w:p>

</xml_diff>